<commit_message>
Relatório 3: fontes em todos os dados do roadmap, incluindo o passo 10
Síntese do Relatório 2 passa a apontar para a nova versão do Relatório 3.

Co-Authored-By: Claude Opus 5.5 <noreply@anthropic.com>
Claude-Session: https://claude.ai/code/session_014VpYYBWAWP858VZtSC21wh
</commit_message>
<xml_diff>
--- a/entregaveis/Relatório 3 Direcionamentos Week Haircare.docx
+++ b/entregaveis/Relatório 3 Direcionamentos Week Haircare.docx
@@ -83,7 +83,7 @@
         </w:rPr>
         <w:t xml:space="preserve">Este relatório fecha a análise de mercado. Ele transforma as recomendações do Relatório 1, sobre o setor, e do </w:t>
       </w:r>
-      <w:hyperlink w:history="1" r:id="rIdazv5gslhf35siytwbrgv0">
+      <w:hyperlink w:history="1" r:id="rIdhuj3terqawfjuzklgzy_v">
         <w:r>
           <w:rPr>
             <w:rFonts w:ascii="Montserrat" w:cs="Montserrat" w:eastAsia="Montserrat" w:hAnsi="Montserrat"/>
@@ -122,9 +122,34 @@
           <w:sz w:val="20"/>
           <w:szCs w:val="20"/>
         </w:rPr>
-        <w:t xml:space="preserve">Para definir a ordem, perguntamos de cada ação: ela tem prazo ou trava outra etapa? Dá para fazer agora, com o que vocês já têm? A fórmula, que fecha entre novembro e o início de dezembro, vem primeiro; o preço, que depende da pesquisa, espera. Cada passo traz o que fazer, por que, como, quem faz e o ponto da </w:t>
-      </w:r>
-      <w:hyperlink w:history="1" r:id="rIdwup1ondjqj_z1yg6bdosl">
+        <w:t xml:space="preserve">Para definir a ordem, perguntamos de cada ação: ela tem prazo ou trava outra etapa? Dá para fazer agora, com o que vocês já têm? A fórmula, que fecha entre novembro e o início de dezembro, segundo o </w:t>
+      </w:r>
+      <w:hyperlink w:history="1" r:id="rIdxt5dwnp4nff1byukarakw">
+        <w:r>
+          <w:rPr>
+            <w:rFonts w:ascii="Montserrat" w:cs="Montserrat" w:eastAsia="Montserrat" w:hAnsi="Montserrat"/>
+            <w:b w:val="false"/>
+            <w:bCs w:val="false"/>
+            <w:color w:val="315CB6"/>
+            <w:sz w:val="20"/>
+            <w:szCs w:val="20"/>
+            <w:u w:val="single"/>
+          </w:rPr>
+          <w:t xml:space="preserve">documento de Tendências</w:t>
+        </w:r>
+      </w:hyperlink>
+      <w:r>
+        <w:rPr>
+          <w:rFonts w:ascii="Montserrat" w:cs="Montserrat" w:eastAsia="Montserrat" w:hAnsi="Montserrat"/>
+          <w:b w:val="false"/>
+          <w:bCs w:val="false"/>
+          <w:color w:val="262626"/>
+          <w:sz w:val="20"/>
+          <w:szCs w:val="20"/>
+        </w:rPr>
+        <w:t xml:space="preserve">, vem primeiro; o preço, que depende da pesquisa, espera. Cada passo traz o que fazer, por que, como, quem faz e o ponto da </w:t>
+      </w:r>
+      <w:hyperlink w:history="1" r:id="rId5qnz7uqeqyuol0kq5ypqp">
         <w:r>
           <w:rPr>
             <w:rFonts w:ascii="Montserrat" w:cs="Montserrat" w:eastAsia="Montserrat" w:hAnsi="Montserrat"/>
@@ -268,6 +293,7 @@
       <w:tr>
         <w:trPr>
           <w:cantSplit/>
+          <w:tblHeader w:val="false"/>
         </w:trPr>
         <w:tc>
           <w:tcPr>
@@ -287,6 +313,7 @@
           </w:tcPr>
           <w:p>
             <w:pPr>
+              <w:keepNext/>
               <w:spacing w:after="80" w:line="276"/>
             </w:pPr>
             <w:r>
@@ -321,6 +348,7 @@
           </w:tcPr>
           <w:p>
             <w:pPr>
+              <w:keepNext/>
               <w:spacing w:after="80" w:line="276"/>
             </w:pPr>
             <w:r>
@@ -369,6 +397,7 @@
           </w:tcPr>
           <w:p>
             <w:pPr>
+              <w:keepNext/>
               <w:spacing w:after="80" w:line="276"/>
             </w:pPr>
             <w:r>
@@ -417,6 +446,7 @@
           </w:tcPr>
           <w:p>
             <w:pPr>
+              <w:keepNext/>
               <w:spacing w:after="80" w:line="276"/>
             </w:pPr>
             <w:r>
@@ -450,6 +480,7 @@
       <w:tr>
         <w:trPr>
           <w:cantSplit/>
+          <w:tblHeader w:val="false"/>
         </w:trPr>
         <w:tc>
           <w:tcPr>
@@ -470,6 +501,7 @@
           </w:tcPr>
           <w:p>
             <w:pPr>
+              <w:keepNext/>
               <w:spacing w:after="80" w:line="276"/>
             </w:pPr>
             <w:r>
@@ -503,6 +535,7 @@
           </w:tcPr>
           <w:p>
             <w:pPr>
+              <w:keepNext/>
               <w:spacing w:after="80" w:line="276"/>
             </w:pPr>
             <w:r>
@@ -519,6 +552,7 @@
           </w:p>
           <w:p>
             <w:pPr>
+              <w:keepNext/>
               <w:spacing w:after="80" w:line="276"/>
             </w:pPr>
             <w:r>
@@ -535,6 +569,7 @@
           </w:p>
           <w:p>
             <w:pPr>
+              <w:keepNext/>
               <w:spacing w:after="80" w:line="276"/>
             </w:pPr>
             <w:r>
@@ -551,6 +586,7 @@
           </w:p>
           <w:p>
             <w:pPr>
+              <w:keepNext/>
               <w:spacing w:after="80" w:line="276"/>
             </w:pPr>
             <w:r>
@@ -584,6 +620,7 @@
           </w:tcPr>
           <w:p>
             <w:pPr>
+              <w:keepNext/>
               <w:spacing w:after="80" w:line="276"/>
             </w:pPr>
             <w:r>
@@ -600,6 +637,7 @@
           </w:p>
           <w:p>
             <w:pPr>
+              <w:keepNext/>
               <w:spacing w:after="80" w:line="276"/>
             </w:pPr>
             <w:r>
@@ -616,6 +654,7 @@
           </w:p>
           <w:p>
             <w:pPr>
+              <w:keepNext/>
               <w:spacing w:after="80" w:line="276"/>
             </w:pPr>
             <w:r>
@@ -632,6 +671,7 @@
           </w:p>
           <w:p>
             <w:pPr>
+              <w:keepNext/>
               <w:spacing w:after="80" w:line="276"/>
             </w:pPr>
             <w:r>
@@ -665,6 +705,7 @@
           </w:tcPr>
           <w:p>
             <w:pPr>
+              <w:keepNext/>
               <w:spacing w:after="80" w:line="276"/>
             </w:pPr>
             <w:r>
@@ -681,6 +722,7 @@
           </w:p>
           <w:p>
             <w:pPr>
+              <w:keepNext/>
               <w:spacing w:after="80" w:line="276"/>
             </w:pPr>
             <w:r>
@@ -697,6 +739,7 @@
           </w:p>
           <w:p>
             <w:pPr>
+              <w:keepNext/>
               <w:spacing w:after="80" w:line="276"/>
             </w:pPr>
             <w:r>
@@ -716,6 +759,7 @@
       <w:tr>
         <w:trPr>
           <w:cantSplit/>
+          <w:tblHeader w:val="false"/>
         </w:trPr>
         <w:tc>
           <w:tcPr>
@@ -736,6 +780,7 @@
           </w:tcPr>
           <w:p>
             <w:pPr>
+              <w:keepNext/>
               <w:spacing w:after="80" w:line="276"/>
             </w:pPr>
             <w:r>
@@ -769,6 +814,7 @@
           </w:tcPr>
           <w:p>
             <w:pPr>
+              <w:keepNext/>
               <w:spacing w:after="80" w:line="276"/>
             </w:pPr>
             <w:r>
@@ -802,6 +848,7 @@
           </w:tcPr>
           <w:p>
             <w:pPr>
+              <w:keepNext/>
               <w:spacing w:after="80" w:line="276"/>
             </w:pPr>
             <w:r>
@@ -835,6 +882,7 @@
           </w:tcPr>
           <w:p>
             <w:pPr>
+              <w:keepNext/>
               <w:spacing w:after="80" w:line="276"/>
             </w:pPr>
             <w:r>
@@ -854,6 +902,7 @@
       <w:tr>
         <w:trPr>
           <w:cantSplit/>
+          <w:tblHeader w:val="false"/>
         </w:trPr>
         <w:tc>
           <w:tcPr>
@@ -874,6 +923,7 @@
           </w:tcPr>
           <w:p>
             <w:pPr>
+              <w:keepNext w:val="false"/>
               <w:spacing w:after="80" w:line="276"/>
             </w:pPr>
             <w:r>
@@ -907,6 +957,7 @@
           </w:tcPr>
           <w:p>
             <w:pPr>
+              <w:keepNext w:val="false"/>
               <w:spacing w:after="80" w:line="276"/>
             </w:pPr>
             <w:r>
@@ -940,6 +991,7 @@
           </w:tcPr>
           <w:p>
             <w:pPr>
+              <w:keepNext w:val="false"/>
               <w:spacing w:after="80" w:line="276"/>
             </w:pPr>
             <w:r>
@@ -973,6 +1025,7 @@
           </w:tcPr>
           <w:p>
             <w:pPr>
+              <w:keepNext w:val="false"/>
               <w:spacing w:after="80" w:line="276"/>
             </w:pPr>
             <w:r>
@@ -1048,7 +1101,7 @@
         </w:rPr>
         <w:t xml:space="preserve"> Nenhuma marca vende no Brasil shampoo e condicionador premium em dose única para quem toma banho fora de casa. Na curva de valor do </w:t>
       </w:r>
-      <w:hyperlink w:history="1" r:id="rId00rjbtd7oql942vwmmyal">
+      <w:hyperlink w:history="1" r:id="rIdmbrbhsqnsbryrugi5476b">
         <w:r>
           <w:rPr>
             <w:rFonts w:ascii="Montserrat" w:cs="Montserrat" w:eastAsia="Montserrat" w:hAnsi="Montserrat"/>
@@ -1100,7 +1153,7 @@
         </w:rPr>
         <w:t xml:space="preserve"> O sachê de um banho já existe nos hotéis, inclusive em </w:t>
       </w:r>
-      <w:hyperlink w:history="1" r:id="rIdieyu1xkgfwlvhg85-wwpv">
+      <w:hyperlink w:history="1" r:id="rIdmly4pzvsw9pfubeec0whi">
         <w:r>
           <w:rPr>
             <w:rFonts w:ascii="Montserrat" w:cs="Montserrat" w:eastAsia="Montserrat" w:hAnsi="Montserrat"/>
@@ -1123,7 +1176,57 @@
           <w:sz w:val="20"/>
           <w:szCs w:val="20"/>
         </w:rPr>
-        <w:t xml:space="preserve">, por cerca de R$ 0,94 a R$ 2,43 o par. Se o kit da WEEK lembrar esse produto, a cliente vai comparar pelo preço. Quase todos os passos deste roadmap servem para deixar claro o que a WEEK tem de diferente.</w:t>
+        <w:t xml:space="preserve">, por cerca de R$ 0,94 o par na H MAX, segundo orçamento que recebemos como cliente oculto, a R$ 2,43 na Naturys Eco, comprada em pacotes na </w:t>
+      </w:r>
+      <w:hyperlink w:history="1" r:id="rIdjaorn0u4v8y4xlk2sjz2s">
+        <w:r>
+          <w:rPr>
+            <w:rFonts w:ascii="Montserrat" w:cs="Montserrat" w:eastAsia="Montserrat" w:hAnsi="Montserrat"/>
+            <w:b w:val="false"/>
+            <w:bCs w:val="false"/>
+            <w:color w:val="315CB6"/>
+            <w:sz w:val="20"/>
+            <w:szCs w:val="20"/>
+            <w:u w:val="single"/>
+          </w:rPr>
+          <w:t xml:space="preserve">Master Hotelaria</w:t>
+        </w:r>
+      </w:hyperlink>
+      <w:r>
+        <w:rPr>
+          <w:rFonts w:ascii="Montserrat" w:cs="Montserrat" w:eastAsia="Montserrat" w:hAnsi="Montserrat"/>
+          <w:b w:val="false"/>
+          <w:bCs w:val="false"/>
+          <w:color w:val="262626"/>
+          <w:sz w:val="20"/>
+          <w:szCs w:val="20"/>
+        </w:rPr>
+        <w:t xml:space="preserve"> e no </w:t>
+      </w:r>
+      <w:hyperlink w:history="1" r:id="rId62l9gg30mwh7vzs_r3etu">
+        <w:r>
+          <w:rPr>
+            <w:rFonts w:ascii="Montserrat" w:cs="Montserrat" w:eastAsia="Montserrat" w:hAnsi="Montserrat"/>
+            <w:b w:val="false"/>
+            <w:bCs w:val="false"/>
+            <w:color w:val="315CB6"/>
+            <w:sz w:val="20"/>
+            <w:szCs w:val="20"/>
+            <w:u w:val="single"/>
+          </w:rPr>
+          <w:t xml:space="preserve">Mercado Livre</w:t>
+        </w:r>
+      </w:hyperlink>
+      <w:r>
+        <w:rPr>
+          <w:rFonts w:ascii="Montserrat" w:cs="Montserrat" w:eastAsia="Montserrat" w:hAnsi="Montserrat"/>
+          <w:b w:val="false"/>
+          <w:bCs w:val="false"/>
+          <w:color w:val="262626"/>
+          <w:sz w:val="20"/>
+          <w:szCs w:val="20"/>
+        </w:rPr>
+        <w:t xml:space="preserve">. Se o kit da WEEK lembrar esse produto, a cliente vai comparar pelo preço. Quase todos os passos deste roadmap servem para deixar claro o que a WEEK tem de diferente.</w:t>
       </w:r>
     </w:p>
     <w:tbl>
@@ -1145,6 +1248,7 @@
       <w:tr>
         <w:trPr>
           <w:cantSplit/>
+          <w:tblHeader w:val="false"/>
         </w:trPr>
         <w:tc>
           <w:tcPr>
@@ -1165,6 +1269,7 @@
           </w:tcPr>
           <w:p>
             <w:pPr>
+              <w:keepNext/>
               <w:spacing w:after="80" w:line="276"/>
             </w:pPr>
             <w:r>
@@ -1199,6 +1304,7 @@
           </w:tcPr>
           <w:p>
             <w:pPr>
+              <w:keepNext/>
               <w:spacing w:after="80" w:line="276"/>
             </w:pPr>
             <w:r>
@@ -1218,6 +1324,7 @@
       <w:tr>
         <w:trPr>
           <w:cantSplit/>
+          <w:tblHeader w:val="false"/>
         </w:trPr>
         <w:tc>
           <w:tcPr>
@@ -1237,6 +1344,7 @@
           </w:tcPr>
           <w:p>
             <w:pPr>
+              <w:keepNext w:val="false"/>
               <w:spacing w:after="80" w:line="276"/>
             </w:pPr>
             <w:r>
@@ -1253,6 +1361,7 @@
           </w:p>
           <w:p>
             <w:pPr>
+              <w:keepNext w:val="false"/>
               <w:spacing w:after="80" w:line="276"/>
             </w:pPr>
             <w:r>
@@ -1269,6 +1378,7 @@
           </w:p>
           <w:p>
             <w:pPr>
+              <w:keepNext w:val="false"/>
               <w:spacing w:after="80" w:line="276"/>
             </w:pPr>
             <w:r>
@@ -1285,6 +1395,7 @@
           </w:p>
           <w:p>
             <w:pPr>
+              <w:keepNext w:val="false"/>
               <w:spacing w:after="80" w:line="276"/>
             </w:pPr>
             <w:r>
@@ -1298,7 +1409,7 @@
               </w:rPr>
               <w:t xml:space="preserve">O nome WEEK e um </w:t>
             </w:r>
-            <w:hyperlink w:history="1" r:id="rIdq7zndgyjnuvf03l-0vzop">
+            <w:hyperlink w:history="1" r:id="rIdizrmqyz3z2xqfbtp2ktrs">
               <w:r>
                 <w:rPr>
                   <w:rFonts w:ascii="Montserrat" w:cs="Montserrat" w:eastAsia="Montserrat" w:hAnsi="Montserrat"/>
@@ -1332,6 +1443,7 @@
           </w:tcPr>
           <w:p>
             <w:pPr>
+              <w:keepNext w:val="false"/>
               <w:spacing w:after="80" w:line="276"/>
             </w:pPr>
             <w:r>
@@ -1348,6 +1460,7 @@
           </w:p>
           <w:p>
             <w:pPr>
+              <w:keepNext w:val="false"/>
               <w:spacing w:after="80" w:line="276"/>
             </w:pPr>
             <w:r>
@@ -1364,6 +1477,7 @@
           </w:p>
           <w:p>
             <w:pPr>
+              <w:keepNext w:val="false"/>
               <w:spacing w:after="80" w:line="276"/>
             </w:pPr>
             <w:r>
@@ -1380,6 +1494,7 @@
           </w:p>
           <w:p>
             <w:pPr>
+              <w:keepNext w:val="false"/>
               <w:spacing w:after="80" w:line="276"/>
             </w:pPr>
             <w:r>
@@ -1396,6 +1511,7 @@
           </w:p>
           <w:p>
             <w:pPr>
+              <w:keepNext w:val="false"/>
               <w:spacing w:after="80" w:line="276"/>
             </w:pPr>
             <w:r>
@@ -1412,6 +1528,7 @@
           </w:p>
           <w:p>
             <w:pPr>
+              <w:keepNext w:val="false"/>
               <w:spacing w:after="80" w:line="276"/>
             </w:pPr>
             <w:r>
@@ -1502,9 +1619,9 @@
           <w:sz w:val="20"/>
           <w:szCs w:val="20"/>
         </w:rPr>
-        <w:t xml:space="preserve"> A fórmula é o diferencial que a WEEK quer vender, e nenhuma concorrente passou de 4 em prova de qualidade na curva de valor. A </w:t>
-      </w:r>
-      <w:hyperlink w:history="1" r:id="rIdohezujf5tr-24sy6sdzk8">
+        <w:t xml:space="preserve"> A fórmula é o diferencial que a WEEK quer vender, e nenhuma concorrente passou de 4 em prova de qualidade na </w:t>
+      </w:r>
+      <w:hyperlink w:history="1" r:id="rIdgtmlb_0wb43prvdmn3ev7">
         <w:r>
           <w:rPr>
             <w:rFonts w:ascii="Montserrat" w:cs="Montserrat" w:eastAsia="Montserrat" w:hAnsi="Montserrat"/>
@@ -1515,6 +1632,31 @@
             <w:szCs w:val="20"/>
             <w:u w:val="single"/>
           </w:rPr>
+          <w:t xml:space="preserve">curva de valor do Relatório 2</w:t>
+        </w:r>
+      </w:hyperlink>
+      <w:r>
+        <w:rPr>
+          <w:rFonts w:ascii="Montserrat" w:cs="Montserrat" w:eastAsia="Montserrat" w:hAnsi="Montserrat"/>
+          <w:b w:val="false"/>
+          <w:bCs w:val="false"/>
+          <w:color w:val="262626"/>
+          <w:sz w:val="20"/>
+          <w:szCs w:val="20"/>
+        </w:rPr>
+        <w:t xml:space="preserve">. A </w:t>
+      </w:r>
+      <w:hyperlink w:history="1" r:id="rIdede9pabqiw7b-3dh7zyhw">
+        <w:r>
+          <w:rPr>
+            <w:rFonts w:ascii="Montserrat" w:cs="Montserrat" w:eastAsia="Montserrat" w:hAnsi="Montserrat"/>
+            <w:b w:val="false"/>
+            <w:bCs w:val="false"/>
+            <w:color w:val="315CB6"/>
+            <w:sz w:val="20"/>
+            <w:szCs w:val="20"/>
+            <w:u w:val="single"/>
+          </w:rPr>
           <w:t xml:space="preserve">ABIHPEC</w:t>
         </w:r>
       </w:hyperlink>
@@ -1529,7 +1671,7 @@
         </w:rPr>
         <w:t xml:space="preserve"> aponta o uso, no cabelo, de ativos conhecidos dos produtos para o rosto, como niacinamida e ácido hialurônico, e um ingrediente que a cliente reconhece ajuda a defender o preço premium. Já a Squeeze Pod, de dose única, recebe </w:t>
       </w:r>
-      <w:hyperlink w:history="1" r:id="rIdsfgm8fn4tq-wg_qiv0vxl">
+      <w:hyperlink w:history="1" r:id="rIdyu44czrq47ejgf5jettys">
         <w:r>
           <w:rPr>
             <w:rFonts w:ascii="Montserrat" w:cs="Montserrat" w:eastAsia="Montserrat" w:hAnsi="Montserrat"/>
@@ -1675,7 +1817,7 @@
         </w:rPr>
         <w:t xml:space="preserve"> A resistência do papel kraft e a biodegradabilidade ainda são dúvidas. A Plus, que vende sabonete em dose única, orienta abrir o sachê longe da água, segundo a </w:t>
       </w:r>
-      <w:hyperlink w:history="1" r:id="rIdc8hxu2ogeb6ifogsjr3n0">
+      <w:hyperlink w:history="1" r:id="rIdrdjx1zxcwxvtjddwl7z9r">
         <w:r>
           <w:rPr>
             <w:rFonts w:ascii="Montserrat" w:cs="Montserrat" w:eastAsia="Montserrat" w:hAnsi="Montserrat"/>
@@ -1700,7 +1842,7 @@
         </w:rPr>
         <w:t xml:space="preserve">, e uma </w:t>
       </w:r>
-      <w:hyperlink w:history="1" r:id="rIdjt3tz2bqp8_jzajvizyr_">
+      <w:hyperlink w:history="1" r:id="rIdr-lbeyhqdhtyeoktnqqoc">
         <w:r>
           <w:rPr>
             <w:rFonts w:ascii="Montserrat" w:cs="Montserrat" w:eastAsia="Montserrat" w:hAnsi="Montserrat"/>
@@ -1725,7 +1867,7 @@
         </w:rPr>
         <w:t xml:space="preserve"> não a recomendou pela dificuldade de manuseio e pelo preço. Já compradores da Naturys Eco no </w:t>
       </w:r>
-      <w:hyperlink w:history="1" r:id="rIdzlzgxei7kwof7f4n2bmzd">
+      <w:hyperlink w:history="1" r:id="rIdphnzvjzyhiuxiclnxaqpy">
         <w:r>
           <w:rPr>
             <w:rFonts w:ascii="Montserrat" w:cs="Montserrat" w:eastAsia="Montserrat" w:hAnsi="Montserrat"/>
@@ -1750,7 +1892,7 @@
         </w:rPr>
         <w:t xml:space="preserve"> elogiam, sem a marca pedir, o sachê que não abre na mala e abre sem tesoura: se o da WEEK passar no teste, essa vira a promessa da embalagem. E o selo eureciclo da Naturys comprova a compensação da embalagem, e não que ela seja biodegradável, segundo o </w:t>
       </w:r>
-      <w:hyperlink w:history="1" r:id="rId6dh-kx9-lroi0e1ybm-xj">
+      <w:hyperlink w:history="1" r:id="rIdzdax1lhqz6bpxvlzcuxql">
         <w:r>
           <w:rPr>
             <w:rFonts w:ascii="Montserrat" w:cs="Montserrat" w:eastAsia="Montserrat" w:hAnsi="Montserrat"/>
@@ -1896,7 +2038,7 @@
         </w:rPr>
         <w:t xml:space="preserve"> No Brasil, a propriedade da marca vem do registro, que garante o uso exclusivo em todo o país, conforme o </w:t>
       </w:r>
-      <w:hyperlink w:history="1" r:id="rIdqpylxmkvddzqbgksfswxs">
+      <w:hyperlink w:history="1" r:id="rIdq2mxaq_diy9vbjwz2rnvm">
         <w:r>
           <w:rPr>
             <w:rFonts w:ascii="Montserrat" w:cs="Montserrat" w:eastAsia="Montserrat" w:hAnsi="Montserrat"/>
@@ -1921,7 +2063,7 @@
         </w:rPr>
         <w:t xml:space="preserve">. Como WEEK é uma palavra comum, é melhor saber agora se já existe marca parecida em cosméticos, antes de imprimir embalagem. A Kerasys, sem site oficial no Brasil, precisou </w:t>
       </w:r>
-      <w:hyperlink w:history="1" r:id="rIdrhhfpk6-mmhzk5yyw_mec">
+      <w:hyperlink w:history="1" r:id="rIdilwx1slhw2ks431eoyq4r">
         <w:r>
           <w:rPr>
             <w:rFonts w:ascii="Montserrat" w:cs="Montserrat" w:eastAsia="Montserrat" w:hAnsi="Montserrat"/>
@@ -1973,7 +2115,7 @@
         </w:rPr>
         <w:t xml:space="preserve"> Busquem WEEK na base de marcas do INPI, na opção Radical, que encontra nomes parecidos, como orienta o </w:t>
       </w:r>
-      <w:hyperlink w:history="1" r:id="rIdnqcwwmghbqmztwswlmadn">
+      <w:hyperlink w:history="1" r:id="rIdbrjeqyakc2vk3gsjinyhl">
         <w:r>
           <w:rPr>
             <w:rFonts w:ascii="Montserrat" w:cs="Montserrat" w:eastAsia="Montserrat" w:hAnsi="Montserrat"/>
@@ -2090,7 +2232,57 @@
           <w:sz w:val="20"/>
           <w:szCs w:val="20"/>
         </w:rPr>
-        <w:t xml:space="preserve"> Quantas pessoas tomam banho fora de casa e quanto pagariam pelo kit são as maiores dúvidas da WEEK, e nenhuma fonte pública responde. O tamanho de mercado do Relatório 1 depende disso: se 10% dos alunos tomarem banho na academia, e não os 20% da nossa premissa, o mercado no consumidor final cai de R$ 1,85 bilhão para R$ 1,41 bilhão, pelo cálculo da Esag Jr.</w:t>
+        <w:t xml:space="preserve"> Quantas pessoas tomam banho fora de casa e quanto pagariam pelo kit são as maiores dúvidas da WEEK, e nenhuma fonte pública responde. O tamanho de mercado do Relatório 1 depende disso: se 10% dos alunos tomarem banho na academia, e não os 20% da nossa premissa, o mercado no consumidor final cai de R$ 1,85 bilhão para R$ 1,41 bilhão, pelo cálculo de TAM da Esag Jr. no Relatório 1, feito com dados do </w:t>
+      </w:r>
+      <w:hyperlink w:history="1" r:id="rIdx0tmsgidrnaebwmkhnh7n">
+        <w:r>
+          <w:rPr>
+            <w:rFonts w:ascii="Montserrat" w:cs="Montserrat" w:eastAsia="Montserrat" w:hAnsi="Montserrat"/>
+            <w:b w:val="false"/>
+            <w:bCs w:val="false"/>
+            <w:color w:val="315CB6"/>
+            <w:sz w:val="20"/>
+            <w:szCs w:val="20"/>
+            <w:u w:val="single"/>
+          </w:rPr>
+          <w:t xml:space="preserve">Panorama Fitness Brasil</w:t>
+        </w:r>
+      </w:hyperlink>
+      <w:r>
+        <w:rPr>
+          <w:rFonts w:ascii="Montserrat" w:cs="Montserrat" w:eastAsia="Montserrat" w:hAnsi="Montserrat"/>
+          <w:b w:val="false"/>
+          <w:bCs w:val="false"/>
+          <w:color w:val="262626"/>
+          <w:sz w:val="20"/>
+          <w:szCs w:val="20"/>
+        </w:rPr>
+        <w:t xml:space="preserve"> e da </w:t>
+      </w:r>
+      <w:hyperlink w:history="1" r:id="rIdzpupm0a3atfslcrnaajva">
+        <w:r>
+          <w:rPr>
+            <w:rFonts w:ascii="Montserrat" w:cs="Montserrat" w:eastAsia="Montserrat" w:hAnsi="Montserrat"/>
+            <w:b w:val="false"/>
+            <w:bCs w:val="false"/>
+            <w:color w:val="315CB6"/>
+            <w:sz w:val="20"/>
+            <w:szCs w:val="20"/>
+            <w:u w:val="single"/>
+          </w:rPr>
+          <w:t xml:space="preserve">PNAD Contínua Turismo 2024, do IBGE</w:t>
+        </w:r>
+      </w:hyperlink>
+      <w:r>
+        <w:rPr>
+          <w:rFonts w:ascii="Montserrat" w:cs="Montserrat" w:eastAsia="Montserrat" w:hAnsi="Montserrat"/>
+          <w:b w:val="false"/>
+          <w:bCs w:val="false"/>
+          <w:color w:val="262626"/>
+          <w:sz w:val="20"/>
+          <w:szCs w:val="20"/>
+        </w:rPr>
+        <w:t xml:space="preserve">.</w:t>
       </w:r>
     </w:p>
     <w:p>
@@ -2231,7 +2423,7 @@
         </w:rPr>
         <w:t xml:space="preserve"> Sem regularização o kit não pode ser vendido. Cosméticos estão sujeitos à vigilância sanitária pela </w:t>
       </w:r>
-      <w:hyperlink w:history="1" r:id="rIdi1h_1ztxa0epl6xqzmaw4">
+      <w:hyperlink w:history="1" r:id="rIdxtn6br3p9ozicwg4ldrgs">
         <w:r>
           <w:rPr>
             <w:rFonts w:ascii="Montserrat" w:cs="Montserrat" w:eastAsia="Montserrat" w:hAnsi="Montserrat"/>
@@ -2256,7 +2448,7 @@
         </w:rPr>
         <w:t xml:space="preserve">, e só empresas com Autorização de Funcionamento (AFE) regularizam produtos na </w:t>
       </w:r>
-      <w:hyperlink w:history="1" r:id="rIdjmipcaerjigizi3mqatdg">
+      <w:hyperlink w:history="1" r:id="rIdpuqupjhbmmrmurgo7no5f">
         <w:r>
           <w:rPr>
             <w:rFonts w:ascii="Montserrat" w:cs="Montserrat" w:eastAsia="Montserrat" w:hAnsi="Montserrat"/>
@@ -2308,7 +2500,7 @@
         </w:rPr>
         <w:t xml:space="preserve"> Com um responsável técnico, transformem as etapas em um checklist com prazo e responsável. Ao pedir orçamento, perguntem a cada fabricante se tem AFE, se produz fórmula de terceiros, qual o pedido mínimo e o custo por sachê. Como referência, a Estoril pede </w:t>
       </w:r>
-      <w:hyperlink w:history="1" r:id="rIdfxo41mf9kimupthar7qbe">
+      <w:hyperlink w:history="1" r:id="rIdzojc5zznepptd69rfwve_">
         <w:r>
           <w:rPr>
             <w:rFonts w:ascii="Montserrat" w:cs="Montserrat" w:eastAsia="Montserrat" w:hAnsi="Montserrat"/>
@@ -2425,9 +2617,9 @@
           <w:sz w:val="20"/>
           <w:szCs w:val="20"/>
         </w:rPr>
-        <w:t xml:space="preserve"> A cliente vai comparar o kit com o sachê de hotel, de R$ 0,94 a R$ 2,43 o par, com a </w:t>
-      </w:r>
-      <w:hyperlink w:history="1" r:id="rIdqu0lpe_bgq2jmdaimonw0">
+        <w:t xml:space="preserve"> A cliente vai comparar o kit com o sachê de hotel, de R$ 0,94 (H MAX, cliente oculto) a R$ 2,43 o par (</w:t>
+      </w:r>
+      <w:hyperlink w:history="1" r:id="rIdi93wntkdobkzajq1co9vb">
         <w:r>
           <w:rPr>
             <w:rFonts w:ascii="Montserrat" w:cs="Montserrat" w:eastAsia="Montserrat" w:hAnsi="Montserrat"/>
@@ -2438,21 +2630,21 @@
             <w:szCs w:val="20"/>
             <w:u w:val="single"/>
           </w:rPr>
-          <w:t xml:space="preserve">Kerasys</w:t>
-        </w:r>
-      </w:hyperlink>
-      <w:r>
-        <w:rPr>
-          <w:rFonts w:ascii="Montserrat" w:cs="Montserrat" w:eastAsia="Montserrat" w:hAnsi="Montserrat"/>
-          <w:b w:val="false"/>
-          <w:bCs w:val="false"/>
-          <w:color w:val="262626"/>
-          <w:sz w:val="20"/>
-          <w:szCs w:val="20"/>
-        </w:rPr>
-        <w:t xml:space="preserve">, cerca de R$ 19,98 por 30 ml de cada produto, e com o </w:t>
-      </w:r>
-      <w:hyperlink w:history="1" r:id="rId3uolcoroujqgymic6uqgt">
+          <w:t xml:space="preserve">Naturys Eco</w:t>
+        </w:r>
+      </w:hyperlink>
+      <w:r>
+        <w:rPr>
+          <w:rFonts w:ascii="Montserrat" w:cs="Montserrat" w:eastAsia="Montserrat" w:hAnsi="Montserrat"/>
+          <w:b w:val="false"/>
+          <w:bCs w:val="false"/>
+          <w:color w:val="262626"/>
+          <w:sz w:val="20"/>
+          <w:szCs w:val="20"/>
+        </w:rPr>
+        <w:t xml:space="preserve">), com a </w:t>
+      </w:r>
+      <w:hyperlink w:history="1" r:id="rIden_d-kstozitknhgeffr4">
         <w:r>
           <w:rPr>
             <w:rFonts w:ascii="Montserrat" w:cs="Montserrat" w:eastAsia="Montserrat" w:hAnsi="Montserrat"/>
@@ -2463,6 +2655,31 @@
             <w:szCs w:val="20"/>
             <w:u w:val="single"/>
           </w:rPr>
+          <w:t xml:space="preserve">Kerasys</w:t>
+        </w:r>
+      </w:hyperlink>
+      <w:r>
+        <w:rPr>
+          <w:rFonts w:ascii="Montserrat" w:cs="Montserrat" w:eastAsia="Montserrat" w:hAnsi="Montserrat"/>
+          <w:b w:val="false"/>
+          <w:bCs w:val="false"/>
+          <w:color w:val="262626"/>
+          <w:sz w:val="20"/>
+          <w:szCs w:val="20"/>
+        </w:rPr>
+        <w:t xml:space="preserve">, cerca de R$ 19,98 por 30 ml de cada produto, e com o </w:t>
+      </w:r>
+      <w:hyperlink w:history="1" r:id="rId6p45-cz95ipvirbeozjdh">
+        <w:r>
+          <w:rPr>
+            <w:rFonts w:ascii="Montserrat" w:cs="Montserrat" w:eastAsia="Montserrat" w:hAnsi="Montserrat"/>
+            <w:b w:val="false"/>
+            <w:bCs w:val="false"/>
+            <w:color w:val="315CB6"/>
+            <w:sz w:val="20"/>
+            <w:szCs w:val="20"/>
+            <w:u w:val="single"/>
+          </w:rPr>
           <w:t xml:space="preserve">kit de viagem da Four Bty</w:t>
         </w:r>
       </w:hyperlink>
@@ -2477,7 +2694,7 @@
         </w:rPr>
         <w:t xml:space="preserve">, de R$ 27,39. Entre o sachê e o kit de viagem há uma faixa de preço que nenhuma marca ocupa. E o preço alto impede a compra para 50% dos usuários de redes sociais ouvidos pela </w:t>
       </w:r>
-      <w:hyperlink w:history="1" r:id="rIdyytyjkb1n2xp33klwmy_b">
+      <w:hyperlink w:history="1" r:id="rIdbwn_9ismwv_-rp1mlihzt">
         <w:r>
           <w:rPr>
             <w:rFonts w:ascii="Montserrat" w:cs="Montserrat" w:eastAsia="Montserrat" w:hAnsi="Montserrat"/>
@@ -2621,9 +2838,9 @@
           <w:sz w:val="20"/>
           <w:szCs w:val="20"/>
         </w:rPr>
-        <w:t xml:space="preserve"> Na curva de valor, a maior nota em falar com quem usa foi 3: nenhuma concorrente fala com quem treina, trabalha ou viaja. O formato também está indicado: 77% preferem vídeo para pesquisar um produto e 70% confiam mais em foto do produto em uso, segundo a </w:t>
-      </w:r>
-      <w:hyperlink w:history="1" r:id="rIdg5dsxsi9mj7dfhwcfbfbd">
+        <w:t xml:space="preserve"> Na </w:t>
+      </w:r>
+      <w:hyperlink w:history="1" r:id="rIdpz-qzm-e3r3vkaieb_0sw">
         <w:r>
           <w:rPr>
             <w:rFonts w:ascii="Montserrat" w:cs="Montserrat" w:eastAsia="Montserrat" w:hAnsi="Montserrat"/>
@@ -2634,6 +2851,31 @@
             <w:szCs w:val="20"/>
             <w:u w:val="single"/>
           </w:rPr>
+          <w:t xml:space="preserve">curva de valor do Relatório 2</w:t>
+        </w:r>
+      </w:hyperlink>
+      <w:r>
+        <w:rPr>
+          <w:rFonts w:ascii="Montserrat" w:cs="Montserrat" w:eastAsia="Montserrat" w:hAnsi="Montserrat"/>
+          <w:b w:val="false"/>
+          <w:bCs w:val="false"/>
+          <w:color w:val="262626"/>
+          <w:sz w:val="20"/>
+          <w:szCs w:val="20"/>
+        </w:rPr>
+        <w:t xml:space="preserve">, a maior nota em falar com quem usa foi 3: nenhuma concorrente fala com quem treina, trabalha ou viaja. O formato também está indicado: 77% preferem vídeo para pesquisar um produto e 70% confiam mais em foto do produto em uso, segundo a </w:t>
+      </w:r>
+      <w:hyperlink w:history="1" r:id="rIdmz_b0ipozpbgz_lnjpezr">
+        <w:r>
+          <w:rPr>
+            <w:rFonts w:ascii="Montserrat" w:cs="Montserrat" w:eastAsia="Montserrat" w:hAnsi="Montserrat"/>
+            <w:b w:val="false"/>
+            <w:bCs w:val="false"/>
+            <w:color w:val="315CB6"/>
+            <w:sz w:val="20"/>
+            <w:szCs w:val="20"/>
+            <w:u w:val="single"/>
+          </w:rPr>
           <w:t xml:space="preserve">Opinion Box e a Influency.me</w:t>
         </w:r>
       </w:hyperlink>
@@ -2675,7 +2917,7 @@
         </w:rPr>
         <w:t xml:space="preserve"> Comecem já, junto com a pesquisa, mostrando o frasco que vaza na bolsa, os bastidores da marca e os testes do sachê. Perto do lançamento, entram vídeos curtos do kit no vestiário e na mochila. A mensagem abre pela qualidade e pela praticidade, e a sustentabilidade vem depois: em bens de consumo, 37% aceitariam pagar mais por produtos sustentáveis, segundo a </w:t>
       </w:r>
-      <w:hyperlink w:history="1" r:id="rIdp71wfz7u8xl8uiybfrgk1">
+      <w:hyperlink w:history="1" r:id="rIdy5nrycgf7zk16buinxkwz">
         <w:r>
           <w:rPr>
             <w:rFonts w:ascii="Montserrat" w:cs="Montserrat" w:eastAsia="Montserrat" w:hAnsi="Montserrat"/>
@@ -2794,7 +3036,7 @@
         </w:rPr>
         <w:t xml:space="preserve"> O site próprio é o canal principal recomendado nos dois relatórios porque dá controle sobre preço e apresentação, o que falta à Naturys Eco, vendida só por revendas, em </w:t>
       </w:r>
-      <w:hyperlink w:history="1" r:id="rIdg7p1tihtkaofhioeujiof">
+      <w:hyperlink w:history="1" r:id="rId0m81dbl-l522ab4ghsf8s">
         <w:r>
           <w:rPr>
             <w:rFonts w:ascii="Montserrat" w:cs="Montserrat" w:eastAsia="Montserrat" w:hAnsi="Montserrat"/>
@@ -2817,7 +3059,32 @@
           <w:sz w:val="20"/>
           <w:szCs w:val="20"/>
         </w:rPr>
-        <w:t xml:space="preserve">. Na curva, a melhor nota em segurança na compra foi 3: nenhuma marca junta trocas claras, avaliações visíveis e contato depois da entrega.</w:t>
+        <w:t xml:space="preserve">. Na </w:t>
+      </w:r>
+      <w:hyperlink w:history="1" r:id="rIdkvxquvv-0g0eg1jp3p0ad">
+        <w:r>
+          <w:rPr>
+            <w:rFonts w:ascii="Montserrat" w:cs="Montserrat" w:eastAsia="Montserrat" w:hAnsi="Montserrat"/>
+            <w:b w:val="false"/>
+            <w:bCs w:val="false"/>
+            <w:color w:val="315CB6"/>
+            <w:sz w:val="20"/>
+            <w:szCs w:val="20"/>
+            <w:u w:val="single"/>
+          </w:rPr>
+          <w:t xml:space="preserve">curva de valor</w:t>
+        </w:r>
+      </w:hyperlink>
+      <w:r>
+        <w:rPr>
+          <w:rFonts w:ascii="Montserrat" w:cs="Montserrat" w:eastAsia="Montserrat" w:hAnsi="Montserrat"/>
+          <w:b w:val="false"/>
+          <w:bCs w:val="false"/>
+          <w:color w:val="262626"/>
+          <w:sz w:val="20"/>
+          <w:szCs w:val="20"/>
+        </w:rPr>
+        <w:t xml:space="preserve">, a melhor nota em segurança na compra foi 3: nenhuma marca junta trocas claras, avaliações visíveis e contato depois da entrega.</w:t>
       </w:r>
     </w:p>
     <w:p>
@@ -2846,7 +3113,7 @@
         </w:rPr>
         <w:t xml:space="preserve"> Preço visível e kit avulso, sem pedido mínimo; frete antes do carrinho; ingredientes e efeito dos ativos; trocas com o prazo de 7 dias do </w:t>
       </w:r>
-      <w:hyperlink w:history="1" r:id="rIdkzo2nriyytcf4h0xjk37r">
+      <w:hyperlink w:history="1" r:id="rIdwccxdtwytzgto-4cuwx0g">
         <w:r>
           <w:rPr>
             <w:rFonts w:ascii="Montserrat" w:cs="Montserrat" w:eastAsia="Montserrat" w:hAnsi="Montserrat"/>
@@ -2983,7 +3250,7 @@
         </w:rPr>
         <w:t xml:space="preserve"> Beleza é a categoria mais comprada por indicação de influenciador (39%), e a credibilidade do influenciador não depende do tamanho da audiência, segundo a </w:t>
       </w:r>
-      <w:hyperlink w:history="1" r:id="rIdgrpwl7aucsw8nn01q-lhk">
+      <w:hyperlink w:history="1" r:id="rIdiwc8_pjswkbcjp2lw6o9c">
         <w:r>
           <w:rPr>
             <w:rFonts w:ascii="Montserrat" w:cs="Montserrat" w:eastAsia="Montserrat" w:hAnsi="Montserrat"/>
@@ -3127,9 +3394,9 @@
           <w:sz w:val="20"/>
           <w:szCs w:val="20"/>
         </w:rPr>
-        <w:t xml:space="preserve"> Hotéis já compram sachê por menos de R$ 1 de fábricas que os atendem há mais de 20 anos, e a WEEK não deve entrar competindo por preço. As academias premium são o ponto de partida recomendado no Relatório 1, que contou 154 delas e 41 hotéis em Campinas, a partir do </w:t>
-      </w:r>
-      <w:hyperlink w:history="1" r:id="rId195d8bynsk4mubgwtelf8">
+        <w:t xml:space="preserve"> Hotéis já compram sachê por menos de R$ 1 a unidade, como o da Naturys Eco, a R$ 0,85 na </w:t>
+      </w:r>
+      <w:hyperlink w:history="1" r:id="rIdvepe2qiznizgrmgxpchd0">
         <w:r>
           <w:rPr>
             <w:rFonts w:ascii="Montserrat" w:cs="Montserrat" w:eastAsia="Montserrat" w:hAnsi="Montserrat"/>
@@ -3140,21 +3407,21 @@
             <w:szCs w:val="20"/>
             <w:u w:val="single"/>
           </w:rPr>
-          <w:t xml:space="preserve">Panorama Setorial Fitness Brasil 2026</w:t>
-        </w:r>
-      </w:hyperlink>
-      <w:r>
-        <w:rPr>
-          <w:rFonts w:ascii="Montserrat" w:cs="Montserrat" w:eastAsia="Montserrat" w:hAnsi="Montserrat"/>
-          <w:b w:val="false"/>
-          <w:bCs w:val="false"/>
-          <w:color w:val="262626"/>
-          <w:sz w:val="20"/>
-          <w:szCs w:val="20"/>
-        </w:rPr>
-        <w:t xml:space="preserve"> e do </w:t>
-      </w:r>
-      <w:hyperlink w:history="1" r:id="rIdh-u4y6yuk_jaglzhj8ygy">
+          <w:t xml:space="preserve">Master Hotelaria</w:t>
+        </w:r>
+      </w:hyperlink>
+      <w:r>
+        <w:rPr>
+          <w:rFonts w:ascii="Montserrat" w:cs="Montserrat" w:eastAsia="Montserrat" w:hAnsi="Montserrat"/>
+          <w:b w:val="false"/>
+          <w:bCs w:val="false"/>
+          <w:color w:val="262626"/>
+          <w:sz w:val="20"/>
+          <w:szCs w:val="20"/>
+        </w:rPr>
+        <w:t xml:space="preserve">, e o da Naturallys, linha da H MAX, a R$ 0,25 na </w:t>
+      </w:r>
+      <w:hyperlink w:history="1" r:id="rIdgkn4bdwufncrvmxkqcq-c">
         <w:r>
           <w:rPr>
             <w:rFonts w:ascii="Montserrat" w:cs="Montserrat" w:eastAsia="Montserrat" w:hAnsi="Montserrat"/>
@@ -3165,6 +3432,81 @@
             <w:szCs w:val="20"/>
             <w:u w:val="single"/>
           </w:rPr>
+          <w:t xml:space="preserve">ParaHotel</w:t>
+        </w:r>
+      </w:hyperlink>
+      <w:r>
+        <w:rPr>
+          <w:rFonts w:ascii="Montserrat" w:cs="Montserrat" w:eastAsia="Montserrat" w:hAnsi="Montserrat"/>
+          <w:b w:val="false"/>
+          <w:bCs w:val="false"/>
+          <w:color w:val="262626"/>
+          <w:sz w:val="20"/>
+          <w:szCs w:val="20"/>
+        </w:rPr>
+        <w:t xml:space="preserve">. Quem fornece são fábricas com escala e tradição, como a Estoril, </w:t>
+      </w:r>
+      <w:hyperlink w:history="1" r:id="rIdqmghavbbr4tn77yjufqfb">
+        <w:r>
+          <w:rPr>
+            <w:rFonts w:ascii="Montserrat" w:cs="Montserrat" w:eastAsia="Montserrat" w:hAnsi="Montserrat"/>
+            <w:b w:val="false"/>
+            <w:bCs w:val="false"/>
+            <w:color w:val="315CB6"/>
+            <w:sz w:val="20"/>
+            <w:szCs w:val="20"/>
+            <w:u w:val="single"/>
+          </w:rPr>
+          <w:t xml:space="preserve">aberta em 1983</w:t>
+        </w:r>
+      </w:hyperlink>
+      <w:r>
+        <w:rPr>
+          <w:rFonts w:ascii="Montserrat" w:cs="Montserrat" w:eastAsia="Montserrat" w:hAnsi="Montserrat"/>
+          <w:b w:val="false"/>
+          <w:bCs w:val="false"/>
+          <w:color w:val="262626"/>
+          <w:sz w:val="20"/>
+          <w:szCs w:val="20"/>
+        </w:rPr>
+        <w:t xml:space="preserve">. Por isso a WEEK não deve entrar nesse canal competindo por preço. O Relatório 1 recomenda começar o B2B pelas academias premium de Campinas: são poucos clientes, com compra recorrente, que funcionam como vitrine para o site. Pelo cálculo da Esag Jr. no Relatório 1, a cidade tem 154 academias premium e 41 hotéis, com dados do </w:t>
+      </w:r>
+      <w:hyperlink w:history="1" r:id="rIda5bttqenkdcujgzhuf9n9">
+        <w:r>
+          <w:rPr>
+            <w:rFonts w:ascii="Montserrat" w:cs="Montserrat" w:eastAsia="Montserrat" w:hAnsi="Montserrat"/>
+            <w:b w:val="false"/>
+            <w:bCs w:val="false"/>
+            <w:color w:val="315CB6"/>
+            <w:sz w:val="20"/>
+            <w:szCs w:val="20"/>
+            <w:u w:val="single"/>
+          </w:rPr>
+          <w:t xml:space="preserve">Panorama Setorial Fitness Brasil 2026</w:t>
+        </w:r>
+      </w:hyperlink>
+      <w:r>
+        <w:rPr>
+          <w:rFonts w:ascii="Montserrat" w:cs="Montserrat" w:eastAsia="Montserrat" w:hAnsi="Montserrat"/>
+          <w:b w:val="false"/>
+          <w:bCs w:val="false"/>
+          <w:color w:val="262626"/>
+          <w:sz w:val="20"/>
+          <w:szCs w:val="20"/>
+        </w:rPr>
+        <w:t xml:space="preserve">, do </w:t>
+      </w:r>
+      <w:hyperlink w:history="1" r:id="rIdl8qtkj3xcqgfxq9wxtyjc">
+        <w:r>
+          <w:rPr>
+            <w:rFonts w:ascii="Montserrat" w:cs="Montserrat" w:eastAsia="Montserrat" w:hAnsi="Montserrat"/>
+            <w:b w:val="false"/>
+            <w:bCs w:val="false"/>
+            <w:color w:val="315CB6"/>
+            <w:sz w:val="20"/>
+            <w:szCs w:val="20"/>
+            <w:u w:val="single"/>
+          </w:rPr>
           <w:t xml:space="preserve">Cadastur</w:t>
         </w:r>
       </w:hyperlink>
@@ -3177,7 +3519,32 @@
           <w:sz w:val="20"/>
           <w:szCs w:val="20"/>
         </w:rPr>
-        <w:t xml:space="preserve">: poucos clientes, com compra recorrente, que funcionam como vitrine.</w:t>
+        <w:t xml:space="preserve"> e do </w:t>
+      </w:r>
+      <w:hyperlink w:history="1" r:id="rIdpymc8dysnn9opxizrpfsc">
+        <w:r>
+          <w:rPr>
+            <w:rFonts w:ascii="Montserrat" w:cs="Montserrat" w:eastAsia="Montserrat" w:hAnsi="Montserrat"/>
+            <w:b w:val="false"/>
+            <w:bCs w:val="false"/>
+            <w:color w:val="315CB6"/>
+            <w:sz w:val="20"/>
+            <w:szCs w:val="20"/>
+            <w:u w:val="single"/>
+          </w:rPr>
+          <w:t xml:space="preserve">InFOHB nº 221, do FOHB</w:t>
+        </w:r>
+      </w:hyperlink>
+      <w:r>
+        <w:rPr>
+          <w:rFonts w:ascii="Montserrat" w:cs="Montserrat" w:eastAsia="Montserrat" w:hAnsi="Montserrat"/>
+          <w:b w:val="false"/>
+          <w:bCs w:val="false"/>
+          <w:color w:val="262626"/>
+          <w:sz w:val="20"/>
+          <w:szCs w:val="20"/>
+        </w:rPr>
+        <w:t xml:space="preserve">.</w:t>
       </w:r>
     </w:p>
     <w:p>
@@ -3298,9 +3665,34 @@
           <w:sz w:val="20"/>
           <w:szCs w:val="20"/>
         </w:rPr>
-        <w:t xml:space="preserve"> Um kit de uso único acaba rápido, e é na recompra que a WEEK cresce. Não encontramos assinatura em nenhuma das quatro concorrentes. Fora do país, a Plus vendia pelo site com assinatura e 10% de desconto, segundo a </w:t>
-      </w:r>
-      <w:hyperlink w:history="1" r:id="rIdxpbqxwkxsop6uygl_cz3f">
+        <w:t xml:space="preserve"> Um kit de uso único acaba rápido, e é na recompra que a WEEK cresce. Não encontramos assinatura em nenhuma das quatro concorrentes analisadas no </w:t>
+      </w:r>
+      <w:hyperlink w:history="1" r:id="rIdjtgkn7puwajfp7aeqrwam">
+        <w:r>
+          <w:rPr>
+            <w:rFonts w:ascii="Montserrat" w:cs="Montserrat" w:eastAsia="Montserrat" w:hAnsi="Montserrat"/>
+            <w:b w:val="false"/>
+            <w:bCs w:val="false"/>
+            <w:color w:val="315CB6"/>
+            <w:sz w:val="20"/>
+            <w:szCs w:val="20"/>
+            <w:u w:val="single"/>
+          </w:rPr>
+          <w:t xml:space="preserve">Relatório 2</w:t>
+        </w:r>
+      </w:hyperlink>
+      <w:r>
+        <w:rPr>
+          <w:rFonts w:ascii="Montserrat" w:cs="Montserrat" w:eastAsia="Montserrat" w:hAnsi="Montserrat"/>
+          <w:b w:val="false"/>
+          <w:bCs w:val="false"/>
+          <w:color w:val="262626"/>
+          <w:sz w:val="20"/>
+          <w:szCs w:val="20"/>
+        </w:rPr>
+        <w:t xml:space="preserve">. Fora do país, a Plus vendia pelo site com assinatura e 10% de desconto, segundo a </w:t>
+      </w:r>
+      <w:hyperlink w:history="1" r:id="rIdra5_n0ruhq9kgnqzxm26k">
         <w:r>
           <w:rPr>
             <w:rFonts w:ascii="Montserrat" w:cs="Montserrat" w:eastAsia="Montserrat" w:hAnsi="Montserrat"/>
@@ -3458,7 +3850,7 @@
       <w:pPr>
         <w:spacing w:after="40" w:line="300"/>
       </w:pPr>
-      <w:hyperlink w:history="1" r:id="rId3pef40f4uwjcpdqbh9xqb">
+      <w:hyperlink w:history="1" r:id="rIdmc5v0txgqqcz83t9mfe0j">
         <w:r>
           <w:rPr>
             <w:rFonts w:ascii="Montserrat" w:cs="Montserrat" w:eastAsia="Montserrat" w:hAnsi="Montserrat"/>
@@ -3483,7 +3875,7 @@
         </w:rPr>
         <w:t xml:space="preserve">; </w:t>
       </w:r>
-      <w:hyperlink w:history="1" r:id="rIdphwslqjeujf_u0-qskjin">
+      <w:hyperlink w:history="1" r:id="rIdbhbhv_c9kmohhobcztiud">
         <w:r>
           <w:rPr>
             <w:rFonts w:ascii="Montserrat" w:cs="Montserrat" w:eastAsia="Montserrat" w:hAnsi="Montserrat"/>
@@ -3508,7 +3900,7 @@
         </w:rPr>
         <w:t xml:space="preserve">; </w:t>
       </w:r>
-      <w:hyperlink w:history="1" r:id="rIdgtz-b0cwacju07bpd119a">
+      <w:hyperlink w:history="1" r:id="rId6ukwqbkarlihplhgu1e-b">
         <w:r>
           <w:rPr>
             <w:rFonts w:ascii="Montserrat" w:cs="Montserrat" w:eastAsia="Montserrat" w:hAnsi="Montserrat"/>
@@ -3533,7 +3925,7 @@
         </w:rPr>
         <w:t xml:space="preserve">; </w:t>
       </w:r>
-      <w:hyperlink w:history="1" r:id="rIdggmowvlhcy8xi8elf1jij">
+      <w:hyperlink w:history="1" r:id="rIdack8qsbkxjwjpdkxuk7bu">
         <w:r>
           <w:rPr>
             <w:rFonts w:ascii="Montserrat" w:cs="Montserrat" w:eastAsia="Montserrat" w:hAnsi="Montserrat"/>
@@ -3558,7 +3950,7 @@
         </w:rPr>
         <w:t xml:space="preserve">; </w:t>
       </w:r>
-      <w:hyperlink w:history="1" r:id="rIdroxfcwoj9ufgooq7epcop">
+      <w:hyperlink w:history="1" r:id="rId8pxf3peqh7c-m-itma5hp">
         <w:r>
           <w:rPr>
             <w:rFonts w:ascii="Montserrat" w:cs="Montserrat" w:eastAsia="Montserrat" w:hAnsi="Montserrat"/>
@@ -3583,7 +3975,7 @@
         </w:rPr>
         <w:t xml:space="preserve">; </w:t>
       </w:r>
-      <w:hyperlink w:history="1" r:id="rIddxovjn6yhvxalcemp2nhu">
+      <w:hyperlink w:history="1" r:id="rIdr8fn2gvhzopkwyyf0ely4">
         <w:r>
           <w:rPr>
             <w:rFonts w:ascii="Montserrat" w:cs="Montserrat" w:eastAsia="Montserrat" w:hAnsi="Montserrat"/>
@@ -3608,7 +4000,7 @@
         </w:rPr>
         <w:t xml:space="preserve">; </w:t>
       </w:r>
-      <w:hyperlink w:history="1" r:id="rId0wbitobs7m8kar_rr9mbn">
+      <w:hyperlink w:history="1" r:id="rIdkh6jtsqjchoxzu9t9gnnl">
         <w:r>
           <w:rPr>
             <w:rFonts w:ascii="Montserrat" w:cs="Montserrat" w:eastAsia="Montserrat" w:hAnsi="Montserrat"/>
@@ -3619,7 +4011,7 @@
             <w:szCs w:val="17"/>
             <w:u w:val="single"/>
           </w:rPr>
-          <w:t xml:space="preserve">Estoril Cosméticos, linha Eco, 13/10/2026</w:t>
+          <w:t xml:space="preserve">Econodata, cadastro da Estoril Cosméticos, 2026</w:t>
         </w:r>
       </w:hyperlink>
       <w:r>
@@ -3633,7 +4025,7 @@
         </w:rPr>
         <w:t xml:space="preserve">; </w:t>
       </w:r>
-      <w:hyperlink w:history="1" r:id="rIdqkdexwllyljkss3ntxata">
+      <w:hyperlink w:history="1" r:id="rIdyqowk-u4-qqczfjexnqfd">
         <w:r>
           <w:rPr>
             <w:rFonts w:ascii="Montserrat" w:cs="Montserrat" w:eastAsia="Montserrat" w:hAnsi="Montserrat"/>
@@ -3644,7 +4036,7 @@
             <w:szCs w:val="17"/>
             <w:u w:val="single"/>
           </w:rPr>
-          <w:t xml:space="preserve">Fast Company, 2021</w:t>
+          <w:t xml:space="preserve">Estoril Cosméticos, linha Eco, 13/10/2026</w:t>
         </w:r>
       </w:hyperlink>
       <w:r>
@@ -3658,7 +4050,7 @@
         </w:rPr>
         <w:t xml:space="preserve">; </w:t>
       </w:r>
-      <w:hyperlink w:history="1" r:id="rIdg9jbrsrrnvvnrq9ub7ga4">
+      <w:hyperlink w:history="1" r:id="rIdzxflpon-uptzib5nboyma">
         <w:r>
           <w:rPr>
             <w:rFonts w:ascii="Montserrat" w:cs="Montserrat" w:eastAsia="Montserrat" w:hAnsi="Montserrat"/>
@@ -3669,7 +4061,7 @@
             <w:szCs w:val="17"/>
             <w:u w:val="single"/>
           </w:rPr>
-          <w:t xml:space="preserve">Fitness Brasil, Panorama Setorial 2026</w:t>
+          <w:t xml:space="preserve">FOHB, InFOHB nº 221, dez/2025</w:t>
         </w:r>
       </w:hyperlink>
       <w:r>
@@ -3683,7 +4075,7 @@
         </w:rPr>
         <w:t xml:space="preserve">; </w:t>
       </w:r>
-      <w:hyperlink w:history="1" r:id="rIdt8hraj73rdendxtf9kjkd">
+      <w:hyperlink w:history="1" r:id="rId9gdw8iufhbd030_j0zf8k">
         <w:r>
           <w:rPr>
             <w:rFonts w:ascii="Montserrat" w:cs="Montserrat" w:eastAsia="Montserrat" w:hAnsi="Montserrat"/>
@@ -3694,7 +4086,7 @@
             <w:szCs w:val="17"/>
             <w:u w:val="single"/>
           </w:rPr>
-          <w:t xml:space="preserve">Opinion Box e Influency.me, Consumo e Influência Digital 2026, via Folha de Alphaville</w:t>
+          <w:t xml:space="preserve">IBGE, PNAD Contínua Turismo 2024</w:t>
         </w:r>
       </w:hyperlink>
       <w:r>
@@ -3708,7 +4100,7 @@
         </w:rPr>
         <w:t xml:space="preserve">; </w:t>
       </w:r>
-      <w:hyperlink w:history="1" r:id="rIdlmx0yogeawyzsbugnog0_">
+      <w:hyperlink w:history="1" r:id="rIdjnlqkrxizz-s5pg7hypjy">
         <w:r>
           <w:rPr>
             <w:rFonts w:ascii="Montserrat" w:cs="Montserrat" w:eastAsia="Montserrat" w:hAnsi="Montserrat"/>
@@ -3719,7 +4111,7 @@
             <w:szCs w:val="17"/>
             <w:u w:val="single"/>
           </w:rPr>
-          <w:t xml:space="preserve">Four Bty, Kit Travel Hydra, 14/10/2026</w:t>
+          <w:t xml:space="preserve">Fast Company, 2021</w:t>
         </w:r>
       </w:hyperlink>
       <w:r>
@@ -3733,7 +4125,7 @@
         </w:rPr>
         <w:t xml:space="preserve">; </w:t>
       </w:r>
-      <w:hyperlink w:history="1" r:id="rId5ll8puo9cpj2neaik8rtx">
+      <w:hyperlink w:history="1" r:id="rId6hqsvu5prra-1tiycoxdc">
         <w:r>
           <w:rPr>
             <w:rFonts w:ascii="Montserrat" w:cs="Montserrat" w:eastAsia="Montserrat" w:hAnsi="Montserrat"/>
@@ -3744,7 +4136,7 @@
             <w:szCs w:val="17"/>
             <w:u w:val="single"/>
           </w:rPr>
-          <w:t xml:space="preserve">INPI, Guia básico de marca</w:t>
+          <w:t xml:space="preserve">Fitness Brasil, Panorama Setorial 2026</w:t>
         </w:r>
       </w:hyperlink>
       <w:r>
@@ -3758,7 +4150,7 @@
         </w:rPr>
         <w:t xml:space="preserve">; </w:t>
       </w:r>
-      <w:hyperlink w:history="1" r:id="rIdnzv0vlxllqflgv6gup67t">
+      <w:hyperlink w:history="1" r:id="rIdv3yxssjqccdaoybun03sl">
         <w:r>
           <w:rPr>
             <w:rFonts w:ascii="Montserrat" w:cs="Montserrat" w:eastAsia="Montserrat" w:hAnsi="Montserrat"/>
@@ -3769,7 +4161,7 @@
             <w:szCs w:val="17"/>
             <w:u w:val="single"/>
           </w:rPr>
-          <w:t xml:space="preserve">Kerasys Brasil, Instagram, 06/07/2026</w:t>
+          <w:t xml:space="preserve">Opinion Box e Influency.me, Consumo e Influência Digital 2026, via Folha de Alphaville</w:t>
         </w:r>
       </w:hyperlink>
       <w:r>
@@ -3783,7 +4175,7 @@
         </w:rPr>
         <w:t xml:space="preserve">; </w:t>
       </w:r>
-      <w:hyperlink w:history="1" r:id="rIdzpx2bsjgo9xuh5h6mp3ua">
+      <w:hyperlink w:history="1" r:id="rIdt8rd35j6c84nu3tehoun0">
         <w:r>
           <w:rPr>
             <w:rFonts w:ascii="Montserrat" w:cs="Montserrat" w:eastAsia="Montserrat" w:hAnsi="Montserrat"/>
@@ -3794,7 +4186,7 @@
             <w:szCs w:val="17"/>
             <w:u w:val="single"/>
           </w:rPr>
-          <w:t xml:space="preserve">Kerasys na Beleza na Web, out/2026</w:t>
+          <w:t xml:space="preserve">Four Bty, Kit Travel Hydra, 14/10/2026</w:t>
         </w:r>
       </w:hyperlink>
       <w:r>
@@ -3808,7 +4200,7 @@
         </w:rPr>
         <w:t xml:space="preserve">; </w:t>
       </w:r>
-      <w:hyperlink w:history="1" r:id="rId_r5yzd-hzkshw6hngextr">
+      <w:hyperlink w:history="1" r:id="rId_v9my4rm1tibqov8oq_ly">
         <w:r>
           <w:rPr>
             <w:rFonts w:ascii="Montserrat" w:cs="Montserrat" w:eastAsia="Montserrat" w:hAnsi="Montserrat"/>
@@ -3819,7 +4211,7 @@
             <w:szCs w:val="17"/>
             <w:u w:val="single"/>
           </w:rPr>
-          <w:t xml:space="preserve">Master Hotelaria, Naturys Eco, out/2026</w:t>
+          <w:t xml:space="preserve">INPI, Guia básico de marca</w:t>
         </w:r>
       </w:hyperlink>
       <w:r>
@@ -3833,7 +4225,7 @@
         </w:rPr>
         <w:t xml:space="preserve">; </w:t>
       </w:r>
-      <w:hyperlink w:history="1" r:id="rIdiltltkmupzw7b1rqdbzvs">
+      <w:hyperlink w:history="1" r:id="rIdwkidh4r_bjeveuamvktxb">
         <w:r>
           <w:rPr>
             <w:rFonts w:ascii="Montserrat" w:cs="Montserrat" w:eastAsia="Montserrat" w:hAnsi="Montserrat"/>
@@ -3844,7 +4236,7 @@
             <w:szCs w:val="17"/>
             <w:u w:val="single"/>
           </w:rPr>
-          <w:t xml:space="preserve">Mercado Livre, avaliações do kit Naturys Eco, 13/10/2026</w:t>
+          <w:t xml:space="preserve">Kerasys Brasil, Instagram, 06/07/2026</w:t>
         </w:r>
       </w:hyperlink>
       <w:r>
@@ -3858,7 +4250,7 @@
         </w:rPr>
         <w:t xml:space="preserve">; </w:t>
       </w:r>
-      <w:hyperlink w:history="1" r:id="rIdmjt7rpvpghtz9v_r9lxtz">
+      <w:hyperlink w:history="1" r:id="rIdgv8kpxpwy1uokczcdw9cx">
         <w:r>
           <w:rPr>
             <w:rFonts w:ascii="Montserrat" w:cs="Montserrat" w:eastAsia="Montserrat" w:hAnsi="Montserrat"/>
@@ -3869,7 +4261,7 @@
             <w:szCs w:val="17"/>
             <w:u w:val="single"/>
           </w:rPr>
-          <w:t xml:space="preserve">Mercado Livre, busca Naturys Eco, 13/10/2026</w:t>
+          <w:t xml:space="preserve">Kerasys na Beleza na Web, out/2026</w:t>
         </w:r>
       </w:hyperlink>
       <w:r>
@@ -3883,7 +4275,7 @@
         </w:rPr>
         <w:t xml:space="preserve">; </w:t>
       </w:r>
-      <w:hyperlink w:history="1" r:id="rIdnv72ycaqv6scysiclpg3r">
+      <w:hyperlink w:history="1" r:id="rIdvvyygkgv_19fb7scmsc1p">
         <w:r>
           <w:rPr>
             <w:rFonts w:ascii="Montserrat" w:cs="Montserrat" w:eastAsia="Montserrat" w:hAnsi="Montserrat"/>
@@ -3894,7 +4286,7 @@
             <w:szCs w:val="17"/>
             <w:u w:val="single"/>
           </w:rPr>
-          <w:t xml:space="preserve">Ministério do Turismo, Cadastur, 2026</w:t>
+          <w:t xml:space="preserve">Master Hotelaria, Naturys Eco, out/2026</w:t>
         </w:r>
       </w:hyperlink>
       <w:r>
@@ -3908,7 +4300,7 @@
         </w:rPr>
         <w:t xml:space="preserve">; </w:t>
       </w:r>
-      <w:hyperlink w:history="1" r:id="rIdl1nb-zx_odolodb0cd1ek">
+      <w:hyperlink w:history="1" r:id="rIdfeoiyshcuqzljkr-ry7ql">
         <w:r>
           <w:rPr>
             <w:rFonts w:ascii="Montserrat" w:cs="Montserrat" w:eastAsia="Montserrat" w:hAnsi="Montserrat"/>
@@ -3919,7 +4311,7 @@
             <w:szCs w:val="17"/>
             <w:u w:val="single"/>
           </w:rPr>
-          <w:t xml:space="preserve">The Reduce Report, avaliação da Plus</w:t>
+          <w:t xml:space="preserve">Mercado Livre, avaliações do kit Naturys Eco, 13/10/2026</w:t>
         </w:r>
       </w:hyperlink>
       <w:r>
@@ -3933,7 +4325,7 @@
         </w:rPr>
         <w:t xml:space="preserve">; </w:t>
       </w:r>
-      <w:hyperlink w:history="1" r:id="rIdjpxu2gvbu4sogjewkf9xd">
+      <w:hyperlink w:history="1" r:id="rId3-sfemftkxevjezmetqk9">
         <w:r>
           <w:rPr>
             <w:rFonts w:ascii="Montserrat" w:cs="Montserrat" w:eastAsia="Montserrat" w:hAnsi="Montserrat"/>
@@ -3944,7 +4336,7 @@
             <w:szCs w:val="17"/>
             <w:u w:val="single"/>
           </w:rPr>
-          <w:t xml:space="preserve">Trustpilot, avaliações da Squeeze Pod</w:t>
+          <w:t xml:space="preserve">Mercado Livre, busca Naturys Eco, 13/10/2026</w:t>
         </w:r>
       </w:hyperlink>
       <w:r>
@@ -3958,7 +4350,7 @@
         </w:rPr>
         <w:t xml:space="preserve">; </w:t>
       </w:r>
-      <w:hyperlink w:history="1" r:id="rId5wkbzh-29tkpzybaejtgk">
+      <w:hyperlink w:history="1" r:id="rIdpz2yoitdaydpjocjpk4ry">
         <w:r>
           <w:rPr>
             <w:rFonts w:ascii="Montserrat" w:cs="Montserrat" w:eastAsia="Montserrat" w:hAnsi="Montserrat"/>
@@ -3969,7 +4361,7 @@
             <w:szCs w:val="17"/>
             <w:u w:val="single"/>
           </w:rPr>
-          <w:t xml:space="preserve">Opinion Box e Neogrid, Tendências de Bens de Consumo 2024, via Varejo S.A.</w:t>
+          <w:t xml:space="preserve">Ministério do Turismo, Cadastur, 2026</w:t>
         </w:r>
       </w:hyperlink>
       <w:r>
@@ -3981,9 +4373,9 @@
           <w:sz w:val="17"/>
           <w:szCs w:val="17"/>
         </w:rPr>
-        <w:t xml:space="preserve">; Esag Jr., Relatório 1, </w:t>
-      </w:r>
-      <w:hyperlink w:history="1" r:id="rIdd5jtihoqcj94juhwprgdc">
+        <w:t xml:space="preserve">; </w:t>
+      </w:r>
+      <w:hyperlink w:history="1" r:id="rId5pvc_yk9coz8n6i55qskd">
         <w:r>
           <w:rPr>
             <w:rFonts w:ascii="Montserrat" w:cs="Montserrat" w:eastAsia="Montserrat" w:hAnsi="Montserrat"/>
@@ -3994,7 +4386,7 @@
             <w:szCs w:val="17"/>
             <w:u w:val="single"/>
           </w:rPr>
-          <w:t xml:space="preserve">Relatório 2</w:t>
+          <w:t xml:space="preserve">ParaHotel, shampoo Naturallys, out/2026</w:t>
         </w:r>
       </w:hyperlink>
       <w:r>
@@ -4006,9 +4398,109 @@
           <w:sz w:val="17"/>
           <w:szCs w:val="17"/>
         </w:rPr>
+        <w:t xml:space="preserve">; </w:t>
+      </w:r>
+      <w:hyperlink w:history="1" r:id="rIdun_g3whevpb3zjusuq0f_">
+        <w:r>
+          <w:rPr>
+            <w:rFonts w:ascii="Montserrat" w:cs="Montserrat" w:eastAsia="Montserrat" w:hAnsi="Montserrat"/>
+            <w:b w:val="false"/>
+            <w:bCs w:val="false"/>
+            <w:color w:val="315CB6"/>
+            <w:sz w:val="17"/>
+            <w:szCs w:val="17"/>
+            <w:u w:val="single"/>
+          </w:rPr>
+          <w:t xml:space="preserve">The Reduce Report, avaliação da Plus</w:t>
+        </w:r>
+      </w:hyperlink>
+      <w:r>
+        <w:rPr>
+          <w:rFonts w:ascii="Montserrat" w:cs="Montserrat" w:eastAsia="Montserrat" w:hAnsi="Montserrat"/>
+          <w:b w:val="false"/>
+          <w:bCs w:val="false"/>
+          <w:color w:val="595959"/>
+          <w:sz w:val="17"/>
+          <w:szCs w:val="17"/>
+        </w:rPr>
+        <w:t xml:space="preserve">; </w:t>
+      </w:r>
+      <w:hyperlink w:history="1" r:id="rIdxorwn5ekz_llb47i5asig">
+        <w:r>
+          <w:rPr>
+            <w:rFonts w:ascii="Montserrat" w:cs="Montserrat" w:eastAsia="Montserrat" w:hAnsi="Montserrat"/>
+            <w:b w:val="false"/>
+            <w:bCs w:val="false"/>
+            <w:color w:val="315CB6"/>
+            <w:sz w:val="17"/>
+            <w:szCs w:val="17"/>
+            <w:u w:val="single"/>
+          </w:rPr>
+          <w:t xml:space="preserve">Trustpilot, avaliações da Squeeze Pod</w:t>
+        </w:r>
+      </w:hyperlink>
+      <w:r>
+        <w:rPr>
+          <w:rFonts w:ascii="Montserrat" w:cs="Montserrat" w:eastAsia="Montserrat" w:hAnsi="Montserrat"/>
+          <w:b w:val="false"/>
+          <w:bCs w:val="false"/>
+          <w:color w:val="595959"/>
+          <w:sz w:val="17"/>
+          <w:szCs w:val="17"/>
+        </w:rPr>
+        <w:t xml:space="preserve">; </w:t>
+      </w:r>
+      <w:hyperlink w:history="1" r:id="rId0cblitudwfkmhlmn1hanx">
+        <w:r>
+          <w:rPr>
+            <w:rFonts w:ascii="Montserrat" w:cs="Montserrat" w:eastAsia="Montserrat" w:hAnsi="Montserrat"/>
+            <w:b w:val="false"/>
+            <w:bCs w:val="false"/>
+            <w:color w:val="315CB6"/>
+            <w:sz w:val="17"/>
+            <w:szCs w:val="17"/>
+            <w:u w:val="single"/>
+          </w:rPr>
+          <w:t xml:space="preserve">Opinion Box e Neogrid, Tendências de Bens de Consumo 2024, via Varejo S.A.</w:t>
+        </w:r>
+      </w:hyperlink>
+      <w:r>
+        <w:rPr>
+          <w:rFonts w:ascii="Montserrat" w:cs="Montserrat" w:eastAsia="Montserrat" w:hAnsi="Montserrat"/>
+          <w:b w:val="false"/>
+          <w:bCs w:val="false"/>
+          <w:color w:val="595959"/>
+          <w:sz w:val="17"/>
+          <w:szCs w:val="17"/>
+        </w:rPr>
+        <w:t xml:space="preserve">; Esag Jr., Relatório 1, </w:t>
+      </w:r>
+      <w:hyperlink w:history="1" r:id="rIds1ux54gbxh43uqf49utbx">
+        <w:r>
+          <w:rPr>
+            <w:rFonts w:ascii="Montserrat" w:cs="Montserrat" w:eastAsia="Montserrat" w:hAnsi="Montserrat"/>
+            <w:b w:val="false"/>
+            <w:bCs w:val="false"/>
+            <w:color w:val="315CB6"/>
+            <w:sz w:val="17"/>
+            <w:szCs w:val="17"/>
+            <w:u w:val="single"/>
+          </w:rPr>
+          <w:t xml:space="preserve">Relatório 2</w:t>
+        </w:r>
+      </w:hyperlink>
+      <w:r>
+        <w:rPr>
+          <w:rFonts w:ascii="Montserrat" w:cs="Montserrat" w:eastAsia="Montserrat" w:hAnsi="Montserrat"/>
+          <w:b w:val="false"/>
+          <w:bCs w:val="false"/>
+          <w:color w:val="595959"/>
+          <w:sz w:val="17"/>
+          <w:szCs w:val="17"/>
+        </w:rPr>
         <w:t xml:space="preserve"> e </w:t>
       </w:r>
-      <w:hyperlink w:history="1" r:id="rIdvqw6joh9ak_5qbzd55liq">
+      <w:hyperlink w:history="1" r:id="rIdl5puvbhbmrtbsbmd7tuxs">
         <w:r>
           <w:rPr>
             <w:rFonts w:ascii="Montserrat" w:cs="Montserrat" w:eastAsia="Montserrat" w:hAnsi="Montserrat"/>

</xml_diff>